<commit_message>
Evolution: resolve audit items - renumber chapters 1-31 (27a->28, 28->29, 29->30 drop FINAL, 30->31), Kindle heading scheme (ChapterLabel/Heading1 title/Heading2 sections, PartTitle), merge over-fragmented sections in ch3, 5, 23-31, one-sentence-per-line in ch12/20/22, fact fixes (Harbin/Denisovan 2025, Perseverance Cheyava Falls, MSR funding), About the Author page, Further Reading additions, series name, rebuild master
</commit_message>
<xml_diff>
--- a/Evolution/chapters/01 - What Is Life - Schrodingers Question and the Order in the Disorder.docx
+++ b/Evolution/chapters/01 - What Is Life - Schrodingers Question and the Order in the Disorder.docx
@@ -14,7 +14,7 @@
     </w:p>
     <w:p>
       <w:pPr>
-        <w:pStyle w:val="Heading1"/>
+        <w:pStyle w:val="ChapterLabel"/>
         <w:ind w:left="0" w:right="0" w:firstLine="0"/>
         <w:jc w:val="center"/>
       </w:pPr>
@@ -34,7 +34,7 @@
     </w:p>
     <w:p>
       <w:pPr>
-        <w:pStyle w:val="Heading1"/>
+        <w:pStyle w:val="Heading2"/>
         <w:ind w:left="0" w:right="0" w:firstLine="0"/>
         <w:jc w:val="center"/>
       </w:pPr>
@@ -103,7 +103,7 @@
     </w:p>
     <w:p>
       <w:pPr>
-        <w:pStyle w:val="Heading1"/>
+        <w:pStyle w:val="Heading2"/>
         <w:ind w:left="0" w:right="0" w:firstLine="0"/>
         <w:jc w:val="center"/>
       </w:pPr>
@@ -202,7 +202,7 @@
     </w:p>
     <w:p>
       <w:pPr>
-        <w:pStyle w:val="Heading1"/>
+        <w:pStyle w:val="Heading2"/>
         <w:ind w:left="0" w:right="0" w:firstLine="0"/>
         <w:jc w:val="center"/>
       </w:pPr>
@@ -325,7 +325,7 @@
     </w:p>
     <w:p>
       <w:pPr>
-        <w:pStyle w:val="Heading1"/>
+        <w:pStyle w:val="Heading2"/>
         <w:ind w:left="0" w:right="0" w:firstLine="0"/>
         <w:jc w:val="center"/>
       </w:pPr>
@@ -390,7 +390,7 @@
     </w:p>
     <w:p>
       <w:pPr>
-        <w:pStyle w:val="Heading1"/>
+        <w:pStyle w:val="Heading2"/>
         <w:ind w:left="0" w:right="0" w:firstLine="0"/>
         <w:jc w:val="center"/>
       </w:pPr>
@@ -443,7 +443,7 @@
       <w:r>
         <w:br/>
         <w:br/>
-        <w:t>Billions of trillions of molecules have passed through your body in that time, far more than there are stars in the visible universe.</w:t>
+        <w:t>In that time, more molecules have passed through your body than there are stars in the visible universe, by a wide margin.</w:t>
       </w:r>
       <w:r>
         <w:br/>
@@ -527,7 +527,7 @@
     </w:p>
     <w:p>
       <w:pPr>
-        <w:pStyle w:val="Heading1"/>
+        <w:pStyle w:val="Heading2"/>
         <w:ind w:left="0" w:right="0" w:firstLine="0"/>
         <w:jc w:val="center"/>
       </w:pPr>
@@ -630,7 +630,7 @@
     </w:p>
     <w:p>
       <w:pPr>
-        <w:pStyle w:val="Heading1"/>
+        <w:pStyle w:val="Heading2"/>
         <w:ind w:left="0" w:right="0" w:firstLine="0"/>
         <w:jc w:val="center"/>
       </w:pPr>
@@ -732,7 +732,7 @@
     </w:p>
     <w:p>
       <w:pPr>
-        <w:pStyle w:val="Heading1"/>
+        <w:pStyle w:val="Heading2"/>
         <w:ind w:left="0" w:right="0" w:firstLine="0"/>
         <w:jc w:val="center"/>
       </w:pPr>
@@ -836,7 +836,7 @@
     </w:p>
     <w:p>
       <w:pPr>
-        <w:pStyle w:val="Heading1"/>
+        <w:pStyle w:val="Heading2"/>
         <w:ind w:left="0" w:right="0" w:firstLine="0"/>
         <w:jc w:val="center"/>
       </w:pPr>
@@ -910,7 +910,7 @@
     </w:p>
     <w:p>
       <w:pPr>
-        <w:pStyle w:val="Heading1"/>
+        <w:pStyle w:val="Heading2"/>
         <w:ind w:left="0" w:right="0" w:firstLine="0"/>
         <w:jc w:val="center"/>
       </w:pPr>
@@ -979,7 +979,7 @@
     </w:p>
     <w:p>
       <w:pPr>
-        <w:pStyle w:val="Heading1"/>
+        <w:pStyle w:val="Heading2"/>
         <w:ind w:left="0" w:right="0" w:firstLine="0"/>
         <w:jc w:val="center"/>
       </w:pPr>
@@ -1023,7 +1023,7 @@
     </w:p>
     <w:p>
       <w:pPr>
-        <w:pStyle w:val="Heading1"/>
+        <w:pStyle w:val="Heading2"/>
         <w:ind w:left="0" w:right="0" w:firstLine="0"/>
         <w:jc w:val="center"/>
       </w:pPr>
@@ -1102,7 +1102,7 @@
     </w:p>
     <w:p>
       <w:pPr>
-        <w:pStyle w:val="Heading1"/>
+        <w:pStyle w:val="Heading2"/>
         <w:ind w:left="0" w:right="0" w:firstLine="0"/>
         <w:jc w:val="center"/>
       </w:pPr>
@@ -1641,16 +1641,17 @@
     <w:pPr>
       <w:keepNext/>
       <w:keepLines/>
-      <w:spacing w:before="200" w:after="0"/>
+      <w:spacing w:before="480" w:after="0"/>
+      <w:jc w:val="center"/>
       <w:outlineLvl w:val="1"/>
     </w:pPr>
     <w:rPr>
-      <w:rFonts w:asciiTheme="majorHAnsi" w:eastAsiaTheme="majorEastAsia" w:hAnsiTheme="majorHAnsi" w:cstheme="majorBidi"/>
+      <w:rFonts w:ascii="Amazon Ember" w:hAnsi="Amazon Ember" w:cs="Amazon Ember"/>
       <w:b/>
       <w:bCs/>
-      <w:color w:val="4F81BD" w:themeColor="accent1"/>
-      <w:sz w:val="26"/>
-      <w:szCs w:val="26"/>
+      <w:color w:val="0000FF"/>
+      <w:sz w:val="36"/>
+      <w:szCs w:val="36"/>
     </w:rPr>
   </w:style>
   <w:style w:type="paragraph" w:styleId="Heading3">
@@ -1858,12 +1859,12 @@
     <w:uiPriority w:val="9"/>
     <w:rsid w:val="00FC693F"/>
     <w:rPr>
-      <w:rFonts w:asciiTheme="majorHAnsi" w:eastAsiaTheme="majorEastAsia" w:hAnsiTheme="majorHAnsi" w:cstheme="majorBidi"/>
+      <w:rFonts w:ascii="Amazon Ember" w:hAnsi="Amazon Ember" w:cs="Amazon Ember"/>
       <w:b/>
       <w:bCs/>
-      <w:color w:val="365F91" w:themeColor="accent1" w:themeShade="BF"/>
-      <w:sz w:val="28"/>
-      <w:szCs w:val="28"/>
+      <w:color w:val="0000FF"/>
+      <w:sz w:val="36"/>
+      <w:szCs w:val="36"/>
     </w:rPr>
   </w:style>
   <w:style w:type="character" w:customStyle="1" w:styleId="Heading2Char">
@@ -1873,12 +1874,12 @@
     <w:uiPriority w:val="9"/>
     <w:rsid w:val="00FC693F"/>
     <w:rPr>
-      <w:rFonts w:asciiTheme="majorHAnsi" w:eastAsiaTheme="majorEastAsia" w:hAnsiTheme="majorHAnsi" w:cstheme="majorBidi"/>
+      <w:rFonts w:ascii="Amazon Ember" w:hAnsi="Amazon Ember" w:cs="Amazon Ember"/>
       <w:b/>
       <w:bCs/>
-      <w:color w:val="4F81BD" w:themeColor="accent1"/>
-      <w:sz w:val="26"/>
-      <w:szCs w:val="26"/>
+      <w:color w:val="0000FF"/>
+      <w:sz w:val="36"/>
+      <w:szCs w:val="36"/>
     </w:rPr>
   </w:style>
   <w:style w:type="character" w:customStyle="1" w:styleId="Heading3Char">
@@ -13243,6 +13244,46 @@
         <w:shd w:val="clear" w:color="auto" w:fill="FBCAA2" w:themeFill="accent6" w:themeFillTint="7F"/>
       </w:tcPr>
     </w:tblStylePr>
+  </w:style>
+  <w:style w:type="paragraph" w:customStyle="1" w:styleId="ChapterLabel">
+    <w:name w:val="Chapter Label"/>
+    <w:basedOn w:val="Normal"/>
+    <w:next w:val="Normal"/>
+    <w:qFormat/>
+    <w:pPr>
+      <w:keepNext/>
+      <w:keepLines/>
+      <w:spacing w:before="480" w:after="0"/>
+      <w:jc w:val="center"/>
+    </w:pPr>
+    <w:rPr>
+      <w:rFonts w:ascii="Amazon Ember" w:hAnsi="Amazon Ember" w:cs="Amazon Ember"/>
+      <w:b/>
+      <w:bCs/>
+      <w:color w:val="0000FF"/>
+      <w:sz w:val="36"/>
+      <w:szCs w:val="36"/>
+    </w:rPr>
+  </w:style>
+  <w:style w:type="paragraph" w:customStyle="1" w:styleId="PartTitle">
+    <w:name w:val="Part Title"/>
+    <w:basedOn w:val="Normal"/>
+    <w:next w:val="Normal"/>
+    <w:qFormat/>
+    <w:pPr>
+      <w:keepNext/>
+      <w:keepLines/>
+      <w:spacing w:before="480" w:after="0"/>
+      <w:jc w:val="center"/>
+    </w:pPr>
+    <w:rPr>
+      <w:rFonts w:ascii="Amazon Ember" w:hAnsi="Amazon Ember" w:cs="Amazon Ember"/>
+      <w:b/>
+      <w:bCs/>
+      <w:color w:val="0000FF"/>
+      <w:sz w:val="36"/>
+      <w:szCs w:val="36"/>
+    </w:rPr>
   </w:style>
 </w:styles>
 </file>

</xml_diff>